<commit_message>
Name tags: drop em/어린이 as well
Co-Authored-By: Claude Sonnet 5.5 <noreply@anthropic.com>
Claude-Session: https://claude.ai/code/session_01EMYMDrRc1h5sANjA4pYFaR
</commit_message>
<xml_diff>
--- a/베트남어학습반_명찰.docx
+++ b/베트남어학습반_명찰.docx
@@ -450,21 +450,21 @@
                 <w:sz w:val="88"/>
                 <w:szCs w:val="88"/>
               </w:rPr>
-              <w:t xml:space="preserve">em Na</w:t>
-            </w:r>
-          </w:p>
-          <w:p>
-            <w:pPr>
-              <w:jc w:val="center"/>
-            </w:pPr>
-            <w:r>
-              <w:rPr>
-                <w:rFonts w:ascii="Malgun Gothic" w:cs="Malgun Gothic" w:eastAsia="Malgun Gothic" w:hAnsi="Malgun Gothic"/>
-                <w:color w:val="444444"/>
-                <w:sz w:val="26"/>
-                <w:szCs w:val="26"/>
-              </w:rPr>
-              <w:t xml:space="preserve">박유나 어린이</w:t>
+              <w:t xml:space="preserve">Na</w:t>
+            </w:r>
+          </w:p>
+          <w:p>
+            <w:pPr>
+              <w:jc w:val="center"/>
+            </w:pPr>
+            <w:r>
+              <w:rPr>
+                <w:rFonts w:ascii="Malgun Gothic" w:cs="Malgun Gothic" w:eastAsia="Malgun Gothic" w:hAnsi="Malgun Gothic"/>
+                <w:color w:val="444444"/>
+                <w:sz w:val="26"/>
+                <w:szCs w:val="26"/>
+              </w:rPr>
+              <w:t xml:space="preserve">박유나</w:t>
             </w:r>
           </w:p>
         </w:tc>
@@ -804,69 +804,69 @@
                 <w:sz w:val="88"/>
                 <w:szCs w:val="88"/>
               </w:rPr>
-              <w:t xml:space="preserve">em Thiên Vy</w:t>
-            </w:r>
-          </w:p>
-          <w:p>
-            <w:pPr>
-              <w:jc w:val="center"/>
-            </w:pPr>
-            <w:r>
-              <w:rPr>
-                <w:rFonts w:ascii="Malgun Gothic" w:cs="Malgun Gothic" w:eastAsia="Malgun Gothic" w:hAnsi="Malgun Gothic"/>
-                <w:color w:val="444444"/>
-                <w:sz w:val="26"/>
-                <w:szCs w:val="26"/>
-              </w:rPr>
-              <w:t xml:space="preserve">이제희 어린이</w:t>
-            </w:r>
-          </w:p>
-        </w:tc>
-        <w:tc>
-          <w:tcPr>
-            <w:tcW w:type="dxa" w:w="5102"/>
-            <w:tcBorders>
-              <w:top w:val="single" w:color="999999" w:sz="4"/>
-              <w:left w:val="single" w:color="999999" w:sz="4"/>
-              <w:bottom w:val="single" w:color="999999" w:sz="4"/>
-              <w:right w:val="single" w:color="999999" w:sz="4"/>
-            </w:tcBorders>
-            <w:tcMar>
-              <w:top w:type="dxa" w:w="60"/>
-              <w:left w:type="dxa" w:w="100"/>
-              <w:bottom w:type="dxa" w:w="60"/>
-              <w:right w:type="dxa" w:w="100"/>
-            </w:tcMar>
-            <w:vAlign w:val="center"/>
-          </w:tcPr>
-          <w:p>
-            <w:pPr>
-              <w:spacing w:after="120"/>
-              <w:jc w:val="center"/>
-            </w:pPr>
-            <w:r>
-              <w:rPr>
-                <w:rFonts w:ascii="Arial" w:cs="Arial" w:eastAsia="Arial" w:hAnsi="Arial"/>
-                <w:b/>
-                <w:bCs/>
-                <w:sz w:val="88"/>
-                <w:szCs w:val="88"/>
-              </w:rPr>
-              <w:t xml:space="preserve">em Thiên Nga</w:t>
-            </w:r>
-          </w:p>
-          <w:p>
-            <w:pPr>
-              <w:jc w:val="center"/>
-            </w:pPr>
-            <w:r>
-              <w:rPr>
-                <w:rFonts w:ascii="Malgun Gothic" w:cs="Malgun Gothic" w:eastAsia="Malgun Gothic" w:hAnsi="Malgun Gothic"/>
-                <w:color w:val="444444"/>
-                <w:sz w:val="26"/>
-                <w:szCs w:val="26"/>
-              </w:rPr>
-              <w:t xml:space="preserve">이제아 어린이</w:t>
+              <w:t xml:space="preserve">Thiên Vy</w:t>
+            </w:r>
+          </w:p>
+          <w:p>
+            <w:pPr>
+              <w:jc w:val="center"/>
+            </w:pPr>
+            <w:r>
+              <w:rPr>
+                <w:rFonts w:ascii="Malgun Gothic" w:cs="Malgun Gothic" w:eastAsia="Malgun Gothic" w:hAnsi="Malgun Gothic"/>
+                <w:color w:val="444444"/>
+                <w:sz w:val="26"/>
+                <w:szCs w:val="26"/>
+              </w:rPr>
+              <w:t xml:space="preserve">이제희</w:t>
+            </w:r>
+          </w:p>
+        </w:tc>
+        <w:tc>
+          <w:tcPr>
+            <w:tcW w:type="dxa" w:w="5102"/>
+            <w:tcBorders>
+              <w:top w:val="single" w:color="999999" w:sz="4"/>
+              <w:left w:val="single" w:color="999999" w:sz="4"/>
+              <w:bottom w:val="single" w:color="999999" w:sz="4"/>
+              <w:right w:val="single" w:color="999999" w:sz="4"/>
+            </w:tcBorders>
+            <w:tcMar>
+              <w:top w:type="dxa" w:w="60"/>
+              <w:left w:type="dxa" w:w="100"/>
+              <w:bottom w:type="dxa" w:w="60"/>
+              <w:right w:type="dxa" w:w="100"/>
+            </w:tcMar>
+            <w:vAlign w:val="center"/>
+          </w:tcPr>
+          <w:p>
+            <w:pPr>
+              <w:spacing w:after="120"/>
+              <w:jc w:val="center"/>
+            </w:pPr>
+            <w:r>
+              <w:rPr>
+                <w:rFonts w:ascii="Arial" w:cs="Arial" w:eastAsia="Arial" w:hAnsi="Arial"/>
+                <w:b/>
+                <w:bCs/>
+                <w:sz w:val="88"/>
+                <w:szCs w:val="88"/>
+              </w:rPr>
+              <w:t xml:space="preserve">Thiên Nga</w:t>
+            </w:r>
+          </w:p>
+          <w:p>
+            <w:pPr>
+              <w:jc w:val="center"/>
+            </w:pPr>
+            <w:r>
+              <w:rPr>
+                <w:rFonts w:ascii="Malgun Gothic" w:cs="Malgun Gothic" w:eastAsia="Malgun Gothic" w:hAnsi="Malgun Gothic"/>
+                <w:color w:val="444444"/>
+                <w:sz w:val="26"/>
+                <w:szCs w:val="26"/>
+              </w:rPr>
+              <w:t xml:space="preserve">이제아</w:t>
             </w:r>
           </w:p>
         </w:tc>
@@ -1104,7 +1104,7 @@
                 <w:sz w:val="88"/>
                 <w:szCs w:val="88"/>
               </w:rPr>
-              <w:t xml:space="preserve">em Chinh Du</w:t>
+              <w:t xml:space="preserve">Chinh Du</w:t>
             </w:r>
           </w:p>
           <w:p>
@@ -1350,7 +1350,7 @@
                 <w:sz w:val="88"/>
                 <w:szCs w:val="88"/>
               </w:rPr>
-              <w:t xml:space="preserve">em Trang Thanh</w:t>
+              <w:t xml:space="preserve">Trang Thanh</w:t>
             </w:r>
           </w:p>
           <w:p>

</xml_diff>